<commit_message>
modified Data availability scetion
</commit_message>
<xml_diff>
--- a/DataAvailability.docx
+++ b/DataAvailability.docx
@@ -24,14 +24,15 @@
         <w:tblLook w:val="04A0" w:firstRow="1" w:lastRow="0" w:firstColumn="1" w:lastColumn="0" w:noHBand="0" w:noVBand="1"/>
       </w:tblPr>
       <w:tblGrid>
-        <w:gridCol w:w="1980"/>
-        <w:gridCol w:w="4394"/>
-        <w:gridCol w:w="2642"/>
+        <w:gridCol w:w="1340"/>
+        <w:gridCol w:w="4300"/>
+        <w:gridCol w:w="1662"/>
+        <w:gridCol w:w="1714"/>
       </w:tblGrid>
       <w:tr>
         <w:tc>
           <w:tcPr>
-            <w:tcW w:w="1980" w:type="dxa"/>
+            <w:tcW w:w="1548" w:type="dxa"/>
           </w:tcPr>
           <w:p>
             <w:pPr>
@@ -51,7 +52,7 @@
         </w:tc>
         <w:tc>
           <w:tcPr>
-            <w:tcW w:w="4394" w:type="dxa"/>
+            <w:tcW w:w="4331" w:type="dxa"/>
           </w:tcPr>
           <w:p>
             <w:pPr>
@@ -78,7 +79,7 @@
         </w:tc>
         <w:tc>
           <w:tcPr>
-            <w:tcW w:w="2642" w:type="dxa"/>
+            <w:tcW w:w="1981" w:type="dxa"/>
           </w:tcPr>
           <w:p>
             <w:pPr>
@@ -96,11 +97,31 @@
             </w:r>
           </w:p>
         </w:tc>
+        <w:tc>
+          <w:tcPr>
+            <w:tcW w:w="1156" w:type="dxa"/>
+          </w:tcPr>
+          <w:p>
+            <w:pPr>
+              <w:rPr>
+                <w:b/>
+                <w:bCs/>
+              </w:rPr>
+            </w:pPr>
+            <w:r>
+              <w:rPr>
+                <w:b/>
+                <w:bCs/>
+              </w:rPr>
+              <w:t>Remarks</w:t>
+            </w:r>
+          </w:p>
+        </w:tc>
       </w:tr>
       <w:tr>
         <w:tc>
           <w:tcPr>
-            <w:tcW w:w="1980" w:type="dxa"/>
+            <w:tcW w:w="1548" w:type="dxa"/>
           </w:tcPr>
           <w:p>
             <w:r>
@@ -110,50 +131,36 @@
         </w:tc>
         <w:tc>
           <w:tcPr>
-            <w:tcW w:w="4394" w:type="dxa"/>
-          </w:tcPr>
-          <w:p>
-            <w:r>
-              <w:t>dir</w:t>
-            </w:r>
-            <w:r>
-              <w:t>/</w:t>
-            </w:r>
-            <w:r>
-              <w:t>Other/</w:t>
-            </w:r>
-            <w:r>
-              <w:t>SOIL_UKCEH.csv</w:t>
-            </w:r>
-          </w:p>
-          <w:p>
-            <w:r>
-              <w:t>dir</w:t>
-            </w:r>
-            <w:r>
-              <w:t>/</w:t>
-            </w:r>
-            <w:r>
-              <w:t>Other/</w:t>
-            </w:r>
-            <w:r>
-              <w:t>SOIL_MATTHEW.csv</w:t>
-            </w:r>
-          </w:p>
-        </w:tc>
-        <w:tc>
-          <w:tcPr>
-            <w:tcW w:w="2642" w:type="dxa"/>
-          </w:tcPr>
-          <w:p>
-            <w:r>
-              <w:t>T</w:t>
-            </w:r>
-            <w:r>
-              <w:t xml:space="preserve">opsoil attributes </w:t>
-            </w:r>
-            <w:r>
-              <w:t>table</w:t>
+            <w:tcW w:w="4331" w:type="dxa"/>
+          </w:tcPr>
+          <w:p>
+            <w:r>
+              <w:t>dir/Other/SOIL_UKCEH.csv</w:t>
+            </w:r>
+          </w:p>
+          <w:p>
+            <w:r>
+              <w:t>dir/Other/SOIL_MATTHEW.csv</w:t>
+            </w:r>
+          </w:p>
+        </w:tc>
+        <w:tc>
+          <w:tcPr>
+            <w:tcW w:w="1981" w:type="dxa"/>
+          </w:tcPr>
+          <w:p>
+            <w:r>
+              <w:t>soil attributes table</w:t>
+            </w:r>
+          </w:p>
+        </w:tc>
+        <w:tc>
+          <w:tcPr>
+            <w:tcW w:w="1156" w:type="dxa"/>
+          </w:tcPr>
+          <w:p>
+            <w:r>
+              <w:t>Extract topsoil attributes for classification</w:t>
             </w:r>
           </w:p>
         </w:tc>
@@ -161,7 +168,7 @@
       <w:tr>
         <w:tc>
           <w:tcPr>
-            <w:tcW w:w="1980" w:type="dxa"/>
+            <w:tcW w:w="1548" w:type="dxa"/>
           </w:tcPr>
           <w:p>
             <w:r>
@@ -171,17 +178,11 @@
         </w:tc>
         <w:tc>
           <w:tcPr>
-            <w:tcW w:w="4394" w:type="dxa"/>
-          </w:tcPr>
-          <w:p>
-            <w:r>
-              <w:t>dir</w:t>
-            </w:r>
-            <w:r>
-              <w:t>/</w:t>
-            </w:r>
-            <w:r>
-              <w:t>Other/</w:t>
+            <w:tcW w:w="4331" w:type="dxa"/>
+          </w:tcPr>
+          <w:p>
+            <w:r>
+              <w:t>dir/Other/</w:t>
             </w:r>
             <w:r>
               <w:t>SOIL_data_Final</w:t>
@@ -193,11 +194,21 @@
         </w:tc>
         <w:tc>
           <w:tcPr>
-            <w:tcW w:w="2642" w:type="dxa"/>
+            <w:tcW w:w="1981" w:type="dxa"/>
           </w:tcPr>
           <w:p>
             <w:r>
               <w:t>Labelled soil data</w:t>
+            </w:r>
+          </w:p>
+        </w:tc>
+        <w:tc>
+          <w:tcPr>
+            <w:tcW w:w="1156" w:type="dxa"/>
+          </w:tcPr>
+          <w:p>
+            <w:r>
+              <w:t>Label the soil types based on soil properties</w:t>
             </w:r>
           </w:p>
         </w:tc>
@@ -205,7 +216,7 @@
       <w:tr>
         <w:tc>
           <w:tcPr>
-            <w:tcW w:w="1980" w:type="dxa"/>
+            <w:tcW w:w="1548" w:type="dxa"/>
           </w:tcPr>
           <w:p>
             <w:r>
@@ -215,7 +226,7 @@
         </w:tc>
         <w:tc>
           <w:tcPr>
-            <w:tcW w:w="4394" w:type="dxa"/>
+            <w:tcW w:w="4331" w:type="dxa"/>
           </w:tcPr>
           <w:p>
             <w:r>
@@ -231,11 +242,21 @@
         </w:tc>
         <w:tc>
           <w:tcPr>
-            <w:tcW w:w="2642" w:type="dxa"/>
+            <w:tcW w:w="1981" w:type="dxa"/>
           </w:tcPr>
           <w:p>
             <w:r>
               <w:t>Labelled Peat/Organic soil data</w:t>
+            </w:r>
+          </w:p>
+        </w:tc>
+        <w:tc>
+          <w:tcPr>
+            <w:tcW w:w="1156" w:type="dxa"/>
+          </w:tcPr>
+          <w:p>
+            <w:r>
+              <w:t>Peat data labelled as Peat/Organic</w:t>
             </w:r>
           </w:p>
         </w:tc>
@@ -246,7 +267,7 @@
         </w:trPr>
         <w:tc>
           <w:tcPr>
-            <w:tcW w:w="1980" w:type="dxa"/>
+            <w:tcW w:w="1548" w:type="dxa"/>
           </w:tcPr>
           <w:p>
             <w:r>
@@ -256,14 +277,11 @@
         </w:tc>
         <w:tc>
           <w:tcPr>
-            <w:tcW w:w="4394" w:type="dxa"/>
-          </w:tcPr>
-          <w:p>
-            <w:r>
-              <w:t>d</w:t>
-            </w:r>
-            <w:r>
-              <w:t>ir/Other/shapefiles/</w:t>
+            <w:tcW w:w="4331" w:type="dxa"/>
+          </w:tcPr>
+          <w:p>
+            <w:r>
+              <w:t>dir/Other/shapefiles/</w:t>
             </w:r>
             <w:r>
               <w:t>Peat_Matthew</w:t>
@@ -291,11 +309,21 @@
         </w:tc>
         <w:tc>
           <w:tcPr>
-            <w:tcW w:w="2642" w:type="dxa"/>
+            <w:tcW w:w="1981" w:type="dxa"/>
           </w:tcPr>
           <w:p>
             <w:r>
               <w:t>Labelled samples for ML</w:t>
+            </w:r>
+          </w:p>
+        </w:tc>
+        <w:tc>
+          <w:tcPr>
+            <w:tcW w:w="1156" w:type="dxa"/>
+          </w:tcPr>
+          <w:p>
+            <w:r>
+              <w:t>Using the labelled soil coordinates extract the corresponding values of the predictors</w:t>
             </w:r>
           </w:p>
         </w:tc>
@@ -306,7 +334,7 @@
         </w:trPr>
         <w:tc>
           <w:tcPr>
-            <w:tcW w:w="1980" w:type="dxa"/>
+            <w:tcW w:w="1548" w:type="dxa"/>
           </w:tcPr>
           <w:p>
             <w:r>
@@ -316,14 +344,11 @@
         </w:tc>
         <w:tc>
           <w:tcPr>
-            <w:tcW w:w="4394" w:type="dxa"/>
-          </w:tcPr>
-          <w:p>
-            <w:r>
-              <w:t>dir/Other/shapefiles/</w:t>
-            </w:r>
-            <w:r>
-              <w:t xml:space="preserve"> </w:t>
+            <w:tcW w:w="4331" w:type="dxa"/>
+          </w:tcPr>
+          <w:p>
+            <w:r>
+              <w:t xml:space="preserve">dir/Other/shapefiles/ </w:t>
             </w:r>
             <w:r>
               <w:t>England_ALC50_GRID</w:t>
@@ -340,11 +365,21 @@
         </w:tc>
         <w:tc>
           <w:tcPr>
-            <w:tcW w:w="2642" w:type="dxa"/>
+            <w:tcW w:w="1981" w:type="dxa"/>
           </w:tcPr>
           <w:p>
             <w:r>
               <w:t xml:space="preserve">dir/GRID, dir/Table: </w:t>
+            </w:r>
+          </w:p>
+        </w:tc>
+        <w:tc>
+          <w:tcPr>
+            <w:tcW w:w="1156" w:type="dxa"/>
+          </w:tcPr>
+          <w:p>
+            <w:r>
+              <w:t>Prepare 50 km x 50 km grids and corresponding csv files of the predictors</w:t>
             </w:r>
           </w:p>
         </w:tc>

</xml_diff>